<commit_message>
Improved UI and anonymiser logic
</commit_message>
<xml_diff>
--- a/documents/TestDocx.docx
+++ b/documents/TestDocx.docx
@@ -11,6 +11,17 @@
         <w:t>toimus</w:t>
       </w:r>
       <w:proofErr w:type="spellEnd"/>
+      <w:r>
+        <w:t xml:space="preserve"> </w:t>
+      </w:r>
+      <w:proofErr w:type="spellStart"/>
+      <w:r>
+        <w:t>Harjumaal</w:t>
+      </w:r>
+      <w:proofErr w:type="spellEnd"/>
+      <w:r>
+        <w:t xml:space="preserve">, </w:t>
+      </w:r>
       <w:r>
         <w:t xml:space="preserve"> </w:t>
       </w:r>

</xml_diff>